<commit_message>
Publish the manager CV: capabilities band, clickable links, reference section
</commit_message>
<xml_diff>
--- a/static/cv/Rithea-Sreng-CV.docx
+++ b/static/cv/Rithea-Sreng-CV.docx
@@ -15,7 +15,7 @@
         <w:pStyle w:val="Tagline"/>
       </w:pPr>
       <w:r>
-        <w:t>Software Development Supervisor | Full Stack Engineer</w:t>
+        <w:t>Software Development Supervisor | Technical Lead</w:t>
       </w:r>
     </w:p>
     <w:p>
@@ -31,16 +31,29 @@
         <w:pStyle w:val="Contact"/>
       </w:pPr>
       <w:r>
-        <w:t>LinkedIn: linkedin.com/in/sreng-rithea-9a885a1a9</w:t>
+        <w:t xml:space="preserve">LinkedIn: </w:t>
       </w:r>
-    </w:p>
-    <w:p>
-      <w:pPr>
-        <w:pStyle w:val="Contact"/>
-      </w:pPr>
+      <w:hyperlink r:id="rId9">
+        <w:r>
+          <w:rPr>
+            <w:color w:val="52306F"/>
+            <w:u w:val="single"/>
+          </w:rPr>
+          <w:t>linkedin.com/in/sreng-rithea-9a885a1a9</w:t>
+        </w:r>
+      </w:hyperlink>
       <w:r>
-        <w:t>Portfolio: rithea-sreng.up.railway.app</w:t>
+        <w:t xml:space="preserve"> · Portfolio: </w:t>
       </w:r>
+      <w:hyperlink r:id="rId10">
+        <w:r>
+          <w:rPr>
+            <w:color w:val="52306F"/>
+            <w:u w:val="single"/>
+          </w:rPr>
+          <w:t>rithea-sreng.up.railway.app</w:t>
+        </w:r>
+      </w:hyperlink>
     </w:p>
     <w:p>
       <w:pPr>
@@ -55,9 +68,89 @@
         <w:pStyle w:val="Body"/>
       </w:pPr>
       <w:r>
-        <w:t>Software development supervisor with 7 years building systems for retail, ERP, logistics and ecommerce in Cambodia. Currently leads web development for the POS platform of a supermarket chain of 20+ stores, a system that runs 24 hours a day, owning architecture, delivery and the supervision of its developers, while coordinating with business and store teams. Stacks from legacy .NET Framework to Vue 3 and .NET Core.</w:t>
+        <w:t>Software development supervisor with 7 years building systems for retail, ERP, logistics and ecommerce in Cambodia. Leads web development for the POS platform of a supermarket chain of 20+ stores: owns the delivery roadmap with business stakeholders, supervises the developers through code review and mentoring, sets the quality standards, and answers for a platform that runs 24 hours a day in every store.</w:t>
       </w:r>
     </w:p>
+    <w:p>
+      <w:pPr>
+        <w:pStyle w:val="SectionH"/>
+      </w:pPr>
+      <w:r>
+        <w:t>CORE CAPABILITIES</w:t>
+      </w:r>
+    </w:p>
+    <w:tbl>
+      <w:tblPr>
+        <w:tblW w:type="auto" w:w="0"/>
+        <w:tblLook w:firstColumn="1" w:firstRow="1" w:lastColumn="0" w:lastRow="0" w:noHBand="0" w:noVBand="1" w:val="04A0"/>
+      </w:tblPr>
+      <w:tblGrid>
+        <w:gridCol w:w="5103"/>
+        <w:gridCol w:w="5103"/>
+      </w:tblGrid>
+      <w:tr>
+        <w:tc>
+          <w:tcPr>
+            <w:tcW w:type="dxa" w:w="5103"/>
+          </w:tcPr>
+          <w:p>
+            <w:pPr>
+              <w:pStyle w:val="SectionH"/>
+            </w:pPr>
+            <w:r>
+              <w:rPr>
+                <w:b/>
+              </w:rPr>
+              <w:t>Soft Skills</w:t>
+            </w:r>
+          </w:p>
+        </w:tc>
+        <w:tc>
+          <w:tcPr>
+            <w:tcW w:type="dxa" w:w="5103"/>
+          </w:tcPr>
+          <w:p>
+            <w:pPr>
+              <w:pStyle w:val="SectionH"/>
+            </w:pPr>
+            <w:r>
+              <w:rPr>
+                <w:b/>
+              </w:rPr>
+              <w:t>Technical Skills</w:t>
+            </w:r>
+          </w:p>
+        </w:tc>
+      </w:tr>
+      <w:tr>
+        <w:tc>
+          <w:tcPr>
+            <w:tcW w:type="dxa" w:w="5103"/>
+          </w:tcPr>
+          <w:p>
+            <w:pPr>
+              <w:pStyle w:val="Body"/>
+            </w:pPr>
+            <w:r>
+              <w:t>Stakeholder Management, Team Supervision, Delivery Planning, Prioritization, Requirements Analysis, Task Management, Time Management, Problem Solving</w:t>
+            </w:r>
+          </w:p>
+        </w:tc>
+        <w:tc>
+          <w:tcPr>
+            <w:tcW w:type="dxa" w:w="5103"/>
+          </w:tcPr>
+          <w:p>
+            <w:pPr>
+              <w:pStyle w:val="Body"/>
+            </w:pPr>
+            <w:r>
+              <w:t>Programming Languages: C#, JavaScript, TypeScript, SQL. Backend: .NET Core and .NET, REST APIs, gRPC, GraphQL, SignalR, WebSocket, Apache Kafka. Frontend: Vue 3 with Nuxt, React. Data: SQL Server, PostgreSQL, SQLite, Redis, Git. DevOps: Docker, CI/CD pipelines, Linux and IIS hosting, AWS, Firebase. Architecture: system and database design, microservices and modular monoliths, SAP integration, offline first POS. Practices: JWT authentication, TDD, deployment and release pipelines (CI/CD)</w:t>
+            </w:r>
+          </w:p>
+        </w:tc>
+      </w:tr>
+    </w:tbl>
     <w:p>
       <w:pPr>
         <w:pStyle w:val="SectionH"/>
@@ -95,7 +188,15 @@
         <w:pStyle w:val="ListBullet"/>
       </w:pPr>
       <w:r>
-        <w:t>Run the full delivery cycle like an owner: design, build, release and support, including release rollouts across stores hosted on nginx or IIS, incident response that covers outside hours, and the escalation path the support team follows.</w:t>
+        <w:t>Own delivery and support end to end: one to three releases a month, each rolled out to every store, incident response that covers outside hours, and the escalation path the support team follows, so store operations have one accountable owner for the platform instead of a handover chain.</w:t>
+      </w:r>
+    </w:p>
+    <w:p>
+      <w:pPr>
+        <w:pStyle w:val="ListBullet"/>
+      </w:pPr>
+      <w:r>
+        <w:t>Built the way the team works: every change passes code review, developers are coached through review and mentoring rather than lectured, and the support team was trained to resolve recurring human error cases at the source.</w:t>
       </w:r>
     </w:p>
     <w:p>
@@ -111,7 +212,7 @@
         <w:pStyle w:val="ListBullet"/>
       </w:pPr>
       <w:r>
-        <w:t>Led the design of checkout that keeps selling offline: each store runs a local SQLite database seeded with the master data it needs, sales continue when the connection drops, and a background scheduler pushes transactions and reconciles on reconnect. All stores now run hybrid.</w:t>
+        <w:t>Led the design of checkout that keeps selling offline, something the platform could not do before I took it over: each store runs a local SQLite database seeded with the master data it needs, sales continue when the connection drops, and a background scheduler pushes transactions and reconciles on reconnect. All stores now run hybrid.</w:t>
       </w:r>
     </w:p>
     <w:p>
@@ -119,7 +220,7 @@
         <w:pStyle w:val="ListBullet"/>
       </w:pPr>
       <w:r>
-        <w:t>Led the SAP integration end to end: a one way outbound feed that writes sales revenue, custom billing, inventory and invoices as plain text files, delivered over SFTP and mapped to the layout SAP expects, so nothing is keyed in by hand.</w:t>
+        <w:t>Led the SAP integration and the rest of the business estate end to end: a one way outbound feed that writes sales revenue, custom billing, inventory and invoices as plain text files over SFTP, and other ERP and business systems connected over SFTP files or APIs, run as soon as a record is ready, inside scheduled windows, or from cron jobs, whichever the receiving system can take.</w:t>
       </w:r>
     </w:p>
     <w:p>
@@ -127,15 +228,7 @@
         <w:pStyle w:val="ListBullet"/>
       </w:pPr>
       <w:r>
-        <w:t>Connected the rest of the business estate the same way: other ERP and business systems connect over SFTP files or APIs, with sync run as soon as a record is ready, inside scheduled windows, or from cron jobs, whichever the receiving system can take.</w:t>
-      </w:r>
-    </w:p>
-    <w:p>
-      <w:pPr>
-        <w:pStyle w:val="ListBullet"/>
-      </w:pPr>
-      <w:r>
-        <w:t>Delivered the features the business sells with, including mix and match promotions and POSM, plus a second POS that runs online only for an internal ERP, and stabilized an inherited codebase on taking over.</w:t>
+        <w:t>Turned around the inherited platform: stabilized the codebase on taking over, improved its performance, and grew the feature set the business sells with, including mix and match promotions and POSM, plus a second POS that runs online only for an internal ERP.</w:t>
       </w:r>
     </w:p>
     <w:p>
@@ -207,7 +300,7 @@
         <w:pStyle w:val="ListBullet"/>
       </w:pPr>
       <w:r>
-        <w:t>Built a logistics system and an ecommerce system from the ground up, covering ordering, fulfilment and delivery, and wrote internal libraries that later projects reused.</w:t>
+        <w:t>Led a small team: planned iterations, delegated work and mentored junior developers.</w:t>
       </w:r>
     </w:p>
     <w:p>
@@ -215,7 +308,7 @@
         <w:pStyle w:val="ListBullet"/>
       </w:pPr>
       <w:r>
-        <w:t>Led a small team: planned iterations, delegated work and mentored junior developers.</w:t>
+        <w:t>Built a logistics system and an ecommerce system from the ground up, covering ordering, fulfilment and delivery, and wrote internal libraries that later projects reused.</w:t>
       </w:r>
     </w:p>
     <w:p>
@@ -239,7 +332,7 @@
         <w:pStyle w:val="ListBullet"/>
       </w:pPr>
       <w:r>
-        <w:t>Own the outcome end to end: plan, design, build, release and support the platform, and stay accountable when live store operations depend on it.</w:t>
+        <w:t>Teach through review: raised developer quality at Chipmong and mentored juniors at One Click Solution with regular code review rather than lectures.</w:t>
       </w:r>
     </w:p>
     <w:p>
@@ -247,7 +340,7 @@
         <w:pStyle w:val="ListBullet"/>
       </w:pPr>
       <w:r>
-        <w:t>Teach through review: raised developer quality at Chipmong and mentored juniors at One Click Solution with regular code review rather than lectures.</w:t>
+        <w:t>Own the outcome end to end: plan, design, build, release and support the platform, and stay accountable when live store operations depend on it.</w:t>
       </w:r>
     </w:p>
     <w:p>
@@ -311,93 +404,81 @@
         <w:pStyle w:val="SectionH"/>
       </w:pPr>
       <w:r>
-        <w:t>TECHNICAL SKILLS</w:t>
+        <w:t>CORE CAPABILITIES</w:t>
       </w:r>
     </w:p>
-    <w:p>
-      <w:pPr>
-        <w:pStyle w:val="Body"/>
-      </w:pPr>
-      <w:r>
-        <w:rPr>
-          <w:b/>
-        </w:rPr>
-        <w:t xml:space="preserve">Languages: </w:t>
-      </w:r>
-      <w:r>
-        <w:t>C#, JavaScript, TypeScript, SQL</w:t>
-      </w:r>
-    </w:p>
-    <w:p>
-      <w:pPr>
-        <w:pStyle w:val="Body"/>
-      </w:pPr>
-      <w:r>
-        <w:rPr>
-          <w:b/>
-        </w:rPr>
-        <w:t xml:space="preserve">Backend: </w:t>
-      </w:r>
-      <w:r>
-        <w:t>.NET Framework 4.x, .NET Core and .NET, REST APIs, Entity Framework Core, SignalR</w:t>
-      </w:r>
-    </w:p>
-    <w:p>
-      <w:pPr>
-        <w:pStyle w:val="Body"/>
-      </w:pPr>
-      <w:r>
-        <w:rPr>
-          <w:b/>
-        </w:rPr>
-        <w:t xml:space="preserve">Frontend: </w:t>
-      </w:r>
-      <w:r>
-        <w:t>Vue 3 with Nuxt, React, Next.js, Svelte, HTML/CSS</w:t>
-      </w:r>
-    </w:p>
-    <w:p>
-      <w:pPr>
-        <w:pStyle w:val="Body"/>
-      </w:pPr>
-      <w:r>
-        <w:rPr>
-          <w:b/>
-        </w:rPr>
-        <w:t xml:space="preserve">Data and tooling: </w:t>
-      </w:r>
-      <w:r>
-        <w:t>SQL Server, PostgreSQL, SQLite, Redis, encrypted data storage, Git</w:t>
-      </w:r>
-    </w:p>
-    <w:p>
-      <w:pPr>
-        <w:pStyle w:val="Body"/>
-      </w:pPr>
-      <w:r>
-        <w:rPr>
-          <w:b/>
-        </w:rPr>
-        <w:t xml:space="preserve">Practices: </w:t>
-      </w:r>
-      <w:r>
-        <w:t>Agile and Scrum, code review, clean and modular architecture, JWT authentication, TDD, system and database design, deployment and release pipelines (CI/CD), SAP integration, AI assisted development</w:t>
-      </w:r>
-    </w:p>
-    <w:p>
-      <w:pPr>
-        <w:pStyle w:val="Body"/>
-      </w:pPr>
-      <w:r>
-        <w:rPr>
-          <w:b/>
-        </w:rPr>
-        <w:t xml:space="preserve">Leadership: </w:t>
-      </w:r>
-      <w:r>
-        <w:t>team supervision, mentoring, task management, prioritization, problem solving, requirements analysis with stakeholders, delivery planning</w:t>
-      </w:r>
-    </w:p>
+    <w:tbl>
+      <w:tblPr>
+        <w:tblW w:type="auto" w:w="0"/>
+        <w:tblLook w:firstColumn="1" w:firstRow="1" w:lastColumn="0" w:lastRow="0" w:noHBand="0" w:noVBand="1" w:val="04A0"/>
+      </w:tblPr>
+      <w:tblGrid>
+        <w:gridCol w:w="5103"/>
+        <w:gridCol w:w="5103"/>
+      </w:tblGrid>
+      <w:tr>
+        <w:tc>
+          <w:tcPr>
+            <w:tcW w:type="dxa" w:w="5103"/>
+          </w:tcPr>
+          <w:p>
+            <w:pPr>
+              <w:pStyle w:val="SectionH"/>
+            </w:pPr>
+            <w:r>
+              <w:rPr>
+                <w:b/>
+              </w:rPr>
+              <w:t>Soft Skills</w:t>
+            </w:r>
+          </w:p>
+        </w:tc>
+        <w:tc>
+          <w:tcPr>
+            <w:tcW w:type="dxa" w:w="5103"/>
+          </w:tcPr>
+          <w:p>
+            <w:pPr>
+              <w:pStyle w:val="SectionH"/>
+            </w:pPr>
+            <w:r>
+              <w:rPr>
+                <w:b/>
+              </w:rPr>
+              <w:t>Technical Skills</w:t>
+            </w:r>
+          </w:p>
+        </w:tc>
+      </w:tr>
+      <w:tr>
+        <w:tc>
+          <w:tcPr>
+            <w:tcW w:type="dxa" w:w="5103"/>
+          </w:tcPr>
+          <w:p>
+            <w:pPr>
+              <w:pStyle w:val="Body"/>
+            </w:pPr>
+            <w:r>
+              <w:t>Stakeholder Management, Team Supervision, Delivery Planning, Prioritization, Requirements Analysis, Task Management, Time Management, Problem Solving</w:t>
+            </w:r>
+          </w:p>
+        </w:tc>
+        <w:tc>
+          <w:tcPr>
+            <w:tcW w:type="dxa" w:w="5103"/>
+          </w:tcPr>
+          <w:p>
+            <w:pPr>
+              <w:pStyle w:val="Body"/>
+            </w:pPr>
+            <w:r>
+              <w:t>Programming Languages: C#, JavaScript, TypeScript, SQL. Backend: .NET Core and .NET, REST APIs, gRPC, GraphQL, SignalR, WebSocket, Apache Kafka. Frontend: Vue 3 with Nuxt, React. Data: SQL Server, PostgreSQL, SQLite, Redis, Git. DevOps: Docker, CI/CD pipelines, Linux and IIS hosting, AWS, Firebase. Architecture: system and database design, microservices and modular monoliths, SAP integration, offline first POS. Practices: JWT authentication, TDD, deployment and release pipelines (CI/CD)</w:t>
+            </w:r>
+          </w:p>
+        </w:tc>
+      </w:tr>
+    </w:tbl>
     <w:p>
       <w:pPr>
         <w:pStyle w:val="SectionH"/>
@@ -412,6 +493,28 @@
       </w:pPr>
       <w:r>
         <w:t>Khmer (native), English (excellent, professional working proficiency)</w:t>
+      </w:r>
+    </w:p>
+    <w:p>
+      <w:pPr>
+        <w:pStyle w:val="SectionH"/>
+      </w:pPr>
+      <w:r>
+        <w:t>REFERENCES</w:t>
+      </w:r>
+    </w:p>
+    <w:p>
+      <w:pPr>
+        <w:pStyle w:val="Body"/>
+      </w:pPr>
+      <w:r>
+        <w:rPr>
+          <w:b/>
+        </w:rPr>
+        <w:t>Mengchou Chorn</w:t>
+      </w:r>
+      <w:r>
+        <w:t>, Supervisor, IT Enterprise Applications, ISI Group, Cambodia · +855 10 244 286</w:t>
       </w:r>
     </w:p>
     <w:sectPr>

</xml_diff>

<commit_message>
Drop the high school line and publish the CV aligned with LinkedIn
</commit_message>
<xml_diff>
--- a/static/cv/Rithea-Sreng-CV.docx
+++ b/static/cv/Rithea-Sreng-CV.docx
@@ -68,7 +68,7 @@
         <w:pStyle w:val="Body"/>
       </w:pPr>
       <w:r>
-        <w:t>Software development supervisor with 7 years building systems for retail, ERP, logistics and ecommerce in Cambodia. Leads web development for the POS platform of a supermarket chain of 20+ stores: owns the delivery roadmap with business stakeholders, supervises the developers through code review and mentoring, sets the quality standards, and answers for a platform that runs 24 hours a day in every store.</w:t>
+        <w:t>Software development supervisor with six years building systems for retail, ERP, logistics and ecommerce in Cambodia. Leads web development for the POS platform of a supermarket chain of 20+ stores: owns the delivery roadmap with business stakeholders, supervises the developers through code review and mentoring, sets the quality standards, and answers for a platform that runs 24 hours a day in every store.</w:t>
       </w:r>
     </w:p>
     <w:p>
@@ -145,7 +145,7 @@
               <w:pStyle w:val="Body"/>
             </w:pPr>
             <w:r>
-              <w:t>Programming Languages: C#, JavaScript, TypeScript, SQL. Backend: .NET Core and .NET, REST APIs, gRPC, GraphQL, SignalR, WebSocket, Apache Kafka. Frontend: Vue 3 with Nuxt, React. Data: SQL Server, PostgreSQL, SQLite, Redis, Git. DevOps: Docker, CI/CD pipelines, Linux and IIS hosting, AWS, Firebase. Architecture: system and database design, microservices and modular monoliths, SAP integration, offline first POS. Practices: JWT authentication, TDD, deployment and release pipelines (CI/CD)</w:t>
+              <w:t>Programming Languages: C#, JavaScript, TypeScript, SQL. Backend: .NET Core and .NET, REST APIs, gRPC, GraphQL, SignalR, WebSocket, Apache Kafka. Frontend: Vue 3 with Nuxt, React, Svelte and SvelteKit. Data: SQL Server, PostgreSQL, SQLite, Redis, Git. DevOps: Docker, CI/CD pipelines, Linux and IIS hosting, Firebase. Architecture: system and database design, microservices and modular monoliths, SAP integration, offline first POS. Practices: JWT authentication, TDD, deployment and release pipelines (CI/CD)</w:t>
             </w:r>
           </w:p>
         </w:tc>
@@ -244,7 +244,7 @@
         <w:pStyle w:val="RoleLine"/>
       </w:pPr>
       <w:r>
-        <w:t>Full Stack Developer | Biztools Enterprise Solutions</w:t>
+        <w:t>Software Engineer | Biztools Enterprise Solutions</w:t>
       </w:r>
     </w:p>
     <w:p>
@@ -252,7 +252,7 @@
         <w:pStyle w:val="Meta"/>
       </w:pPr>
       <w:r>
-        <w:t>Feb 2022 – Jun 2025  |  Phnom Penh, Cambodia</w:t>
+        <w:t>Feb 2023 – Jun 2025  |  Phnom Penh, Cambodia</w:t>
       </w:r>
     </w:p>
     <w:p>
@@ -284,7 +284,7 @@
         <w:pStyle w:val="RoleLine"/>
       </w:pPr>
       <w:r>
-        <w:t>Full Stack Developer and Team Lead | One Click Solution</w:t>
+        <w:t>Full Stack Developer and Project leader | One Click Solution | Part time</w:t>
       </w:r>
     </w:p>
     <w:p>
@@ -292,7 +292,7 @@
         <w:pStyle w:val="Meta"/>
       </w:pPr>
       <w:r>
-        <w:t>Nov 2019 – Jan 2022  |  Phnom Penh, Cambodia</w:t>
+        <w:t>Nov 2020 – Feb 2023  |  Part time  |  Phnom Penh, Cambodia</w:t>
       </w:r>
     </w:p>
     <w:p>
@@ -393,14 +393,6 @@
     </w:p>
     <w:p>
       <w:pPr>
-        <w:pStyle w:val="ListBullet"/>
-      </w:pPr>
-      <w:r>
-        <w:t>High School Diploma, Bak Touk High School (2014 – 2018)</w:t>
-      </w:r>
-    </w:p>
-    <w:p>
-      <w:pPr>
         <w:pStyle w:val="SectionH"/>
       </w:pPr>
       <w:r>
@@ -473,7 +465,7 @@
               <w:pStyle w:val="Body"/>
             </w:pPr>
             <w:r>
-              <w:t>Programming Languages: C#, JavaScript, TypeScript, SQL. Backend: .NET Core and .NET, REST APIs, gRPC, GraphQL, SignalR, WebSocket, Apache Kafka. Frontend: Vue 3 with Nuxt, React. Data: SQL Server, PostgreSQL, SQLite, Redis, Git. DevOps: Docker, CI/CD pipelines, Linux and IIS hosting, AWS, Firebase. Architecture: system and database design, microservices and modular monoliths, SAP integration, offline first POS. Practices: JWT authentication, TDD, deployment and release pipelines (CI/CD)</w:t>
+              <w:t>Programming Languages: C#, JavaScript, TypeScript, SQL. Backend: .NET Core and .NET, REST APIs, gRPC, GraphQL, SignalR, WebSocket, Apache Kafka. Frontend: Vue 3 with Nuxt, React, Svelte and SvelteKit. Data: SQL Server, PostgreSQL, SQLite, Redis, Git. DevOps: Docker, CI/CD pipelines, Linux and IIS hosting, Firebase. Architecture: system and database design, microservices and modular monoliths, SAP integration, offline first POS. Practices: JWT authentication, TDD, deployment and release pipelines (CI/CD)</w:t>
             </w:r>
           </w:p>
         </w:tc>

</xml_diff>

<commit_message>
Say more than seven years, add the 2019 earlier line and republish the CV
</commit_message>
<xml_diff>
--- a/static/cv/Rithea-Sreng-CV.docx
+++ b/static/cv/Rithea-Sreng-CV.docx
@@ -68,7 +68,7 @@
         <w:pStyle w:val="Body"/>
       </w:pPr>
       <w:r>
-        <w:t>Software development supervisor with six years building systems for retail, ERP, logistics and ecommerce in Cambodia. Leads web development for the POS platform of a supermarket chain of 20+ stores: owns the delivery roadmap with business stakeholders, supervises the developers through code review and mentoring, sets the quality standards, and answers for a platform that runs 24 hours a day in every store.</w:t>
+        <w:t>Software development supervisor with more than seven years building systems for retail, ERP, logistics and ecommerce in Cambodia. Leads web development for the POS platform of a supermarket chain of 20+ stores: owns the delivery roadmap with business stakeholders, supervises the developers through code review and mentoring, sets the quality standards, and answers for a platform that runs 24 hours a day in every store.</w:t>
       </w:r>
     </w:p>
     <w:p>
@@ -317,6 +317,14 @@
       </w:pPr>
       <w:r>
         <w:t>Tech: C# (.NET Framework 4.x), JavaScript, SQL Server, SignalR.</w:t>
+      </w:r>
+    </w:p>
+    <w:p>
+      <w:pPr>
+        <w:pStyle w:val="Body"/>
+      </w:pPr>
+      <w:r>
+        <w:t>Earlier: 2019 – 2020, built a logistics system and an ecommerce platform from zero, before the One Click Solution engagement.</w:t>
       </w:r>
     </w:p>
     <w:p>

</xml_diff>

<commit_message>
Publish the completed project management certificate and the refreshed CV
The Google Project Management Professional Certificate is finished, so the site
now names it with its seven courses and links the Coursera credential, and the
separate Agile certificate entry is gone because the Professional Certificate
covers that content. The About paragraph says the same thing. The published PDF
and DOCX are refreshed to the current build, and scripts/check-cv-parity.py now
fails the build when the site drifts from the CV it serves.
</commit_message>
<xml_diff>
--- a/static/cv/Rithea-Sreng-CV.docx
+++ b/static/cv/Rithea-Sreng-CV.docx
@@ -85,13 +85,13 @@
         <w:tblLook w:firstColumn="1" w:firstRow="1" w:lastColumn="0" w:lastRow="0" w:noHBand="0" w:noVBand="1" w:val="04A0"/>
       </w:tblPr>
       <w:tblGrid>
-        <w:gridCol w:w="5103"/>
-        <w:gridCol w:w="5103"/>
+        <w:gridCol w:w="5159"/>
+        <w:gridCol w:w="5159"/>
       </w:tblGrid>
       <w:tr>
         <w:tc>
           <w:tcPr>
-            <w:tcW w:type="dxa" w:w="5103"/>
+            <w:tcW w:type="dxa" w:w="5159"/>
           </w:tcPr>
           <w:p>
             <w:pPr>
@@ -107,7 +107,7 @@
         </w:tc>
         <w:tc>
           <w:tcPr>
-            <w:tcW w:type="dxa" w:w="5103"/>
+            <w:tcW w:type="dxa" w:w="5159"/>
           </w:tcPr>
           <w:p>
             <w:pPr>
@@ -125,7 +125,7 @@
       <w:tr>
         <w:tc>
           <w:tcPr>
-            <w:tcW w:type="dxa" w:w="5103"/>
+            <w:tcW w:type="dxa" w:w="5159"/>
           </w:tcPr>
           <w:p>
             <w:pPr>
@@ -138,7 +138,7 @@
         </w:tc>
         <w:tc>
           <w:tcPr>
-            <w:tcW w:type="dxa" w:w="5103"/>
+            <w:tcW w:type="dxa" w:w="5159"/>
           </w:tcPr>
           <w:p>
             <w:pPr>
@@ -180,7 +180,7 @@
         <w:pStyle w:val="ListBullet"/>
       </w:pPr>
       <w:r>
-        <w:t>Lead web development for the group's POS platform as its supervisor: plan and prioritize the delivery roadmap with business stakeholders, manage the developers through code review and mentoring, set the quality standards, and coordinate daily with store operations and the support team. Accountable for a platform that runs 24/7 across 20+ stores and processed about US$5M in sales in its strongest year, the chain's best sales year while I have led the platform.</w:t>
+        <w:t>Own the group's POS platform across 20+ stores, the chain's best sales year while I have led it at about US$5M in sales, by prioritizing the delivery roadmap with stakeholders, managing the developers through code review and mentoring, and coordinating with store operations daily.</w:t>
       </w:r>
     </w:p>
     <w:p>
@@ -188,7 +188,7 @@
         <w:pStyle w:val="ListBullet"/>
       </w:pPr>
       <w:r>
-        <w:t>Own delivery and support end to end: one to three releases a month, each rolled out to every store, incident response that covers outside hours, and the escalation path the support team follows, so store operations have one accountable owner for the platform instead of a handover chain.</w:t>
+        <w:t>Own delivery and support end to end, one to three releases a month to every store, by running design, release and support myself, accountable for incidents outside hours and escalations.</w:t>
       </w:r>
     </w:p>
     <w:p>
@@ -196,7 +196,7 @@
         <w:pStyle w:val="ListBullet"/>
       </w:pPr>
       <w:r>
-        <w:t>Built the way the team works: every change passes code review, developers are coached through review and mentoring rather than lectured, and the support team was trained to resolve recurring human error cases at the source.</w:t>
+        <w:t>Made every change pass code review before it ships, by coaching developers through review and mentoring rather than lectures, and trained support to fix recurring human error at the source.</w:t>
       </w:r>
     </w:p>
     <w:p>
@@ -204,7 +204,7 @@
         <w:pStyle w:val="ListBullet"/>
       </w:pPr>
       <w:r>
-        <w:t>Directed the architecture the business scaled on: stores grouped behind dedicated API instances, a database per store, one shared central database for chain wide data such as vouchers and customers, and a distribution gateway that routes every request to the right store. The chain grew from 10 to 20+ stores on that design.</w:t>
+        <w:t>Scaled the chain from 10 to 20+ stores on an architecture I designed: API instances per store group, a database per store, one central database for chain wide data, and a routing gateway.</w:t>
       </w:r>
     </w:p>
     <w:p>
@@ -212,7 +212,7 @@
         <w:pStyle w:val="ListBullet"/>
       </w:pPr>
       <w:r>
-        <w:t>Led the design of checkout that keeps selling offline, something the platform could not do before I took it over: each store runs a local SQLite database seeded with the master data it needs, sales continue when the connection drops, and a background scheduler pushes transactions and reconciles on reconnect. All stores now run hybrid.</w:t>
+        <w:t>Kept every store selling when the internet drops, something the platform could not do before I took it over, by putting checkout on a local SQLite database that reconciles on reconnect.</w:t>
       </w:r>
     </w:p>
     <w:p>
@@ -220,7 +220,7 @@
         <w:pStyle w:val="ListBullet"/>
       </w:pPr>
       <w:r>
-        <w:t>Led the SAP integration and the rest of the business estate end to end: a one way outbound feed that writes sales revenue, custom billing, inventory and invoices as plain text files over SFTP, and other ERP and business systems connected over SFTP files or APIs, run as soon as a record is ready, inside scheduled windows, or from cron jobs, whichever the receiving system can take.</w:t>
+        <w:t>Connected the business estate end to end, by feeding other ERP systems over SFTP files or APIs as records are ready, and writing the SAP feed that carries sales revenue and invoices.</w:t>
       </w:r>
     </w:p>
     <w:p>
@@ -228,7 +228,7 @@
         <w:pStyle w:val="ListBullet"/>
       </w:pPr>
       <w:r>
-        <w:t>Turned around the inherited platform: stabilized the codebase on taking over, improved its performance, and grew the feature set the business sells with, including mix and match promotions and POSM, plus a second POS that runs online only for an internal ERP.</w:t>
+        <w:t>Stabilized and grew an inherited platform: fixed the codebase on taking it over, improved its performance, and added the promotions and POSM the business sells with.</w:t>
       </w:r>
     </w:p>
     <w:p>
@@ -260,7 +260,7 @@
         <w:pStyle w:val="ListBullet"/>
       </w:pPr>
       <w:r>
-        <w:t>Built, maintained and enhanced ERP and POS systems for a roster of clients, each with its own requirements, adding a container shipment tracking system, a customer loyalty program, and Flutter and native Android apps for stock counts and loyalty.</w:t>
+        <w:t>Delivered ERP and POS systems for a roster of clients with their own requirements, by adding container shipment tracking, a loyalty program, and Flutter and Android apps for stock counts.</w:t>
       </w:r>
     </w:p>
     <w:p>
@@ -268,7 +268,7 @@
         <w:pStyle w:val="ListBullet"/>
       </w:pPr>
       <w:r>
-        <w:t>Worked every layer from database to interface across two generations of the stack: .NET Framework 4.x and .NET Core, with React, Svelte or Next.js on the frontend.</w:t>
+        <w:t>Shipped every layer of the stack from database to interface across two generations, in .NET Framework and .NET Core with React, Svelte or Next.js.</w:t>
       </w:r>
     </w:p>
     <w:p>
@@ -300,7 +300,7 @@
         <w:pStyle w:val="ListBullet"/>
       </w:pPr>
       <w:r>
-        <w:t>Led a small team: planned iterations, delegated work and mentored junior developers.</w:t>
+        <w:t>Led a small team end to end, by planning iterations, delegating work and mentoring junior developers.</w:t>
       </w:r>
     </w:p>
     <w:p>
@@ -308,7 +308,7 @@
         <w:pStyle w:val="ListBullet"/>
       </w:pPr>
       <w:r>
-        <w:t>Built a logistics system and an ecommerce system from the ground up, covering ordering, fulfilment and delivery, and wrote internal libraries that later projects reused.</w:t>
+        <w:t>Built a logistics system and an ecommerce system from zero, covering ordering, fulfilment and delivery, plus internal libraries later projects reused.</w:t>
       </w:r>
     </w:p>
     <w:p>
@@ -380,15 +380,19 @@
         <w:pStyle w:val="ListBullet"/>
       </w:pPr>
       <w:r>
-        <w:t>Google Project Management Certificate, Coursera, in progress (covers the full project management lifecycle)</w:t>
+        <w:t xml:space="preserve">Google Project Management Certificate, Coursera, 2026, </w:t>
       </w:r>
-    </w:p>
-    <w:p>
-      <w:pPr>
-        <w:pStyle w:val="ListBullet"/>
-      </w:pPr>
+      <w:hyperlink r:id="rId11">
+        <w:r>
+          <w:rPr>
+            <w:color w:val="52306F"/>
+            <w:u w:val="single"/>
+          </w:rPr>
+          <w:t>ID 8SM29XFB8QF8</w:t>
+        </w:r>
+      </w:hyperlink>
       <w:r>
-        <w:t>Google Agile Project Management Certificate, Coursera, 2026 (Agile and Scrum)</w:t>
+        <w:t>: Foundations of Project Management, Project Initiation, Project Planning, Project Execution, Agile Project Management, Capstone</w:t>
       </w:r>
     </w:p>
     <w:p>
@@ -399,86 +403,6 @@
         <w:t>Bachelor of Computer Science, National Polytechnic Institute of Cambodia (2019 – 2022)</w:t>
       </w:r>
     </w:p>
-    <w:p>
-      <w:pPr>
-        <w:pStyle w:val="SectionH"/>
-      </w:pPr>
-      <w:r>
-        <w:t>CORE CAPABILITIES</w:t>
-      </w:r>
-    </w:p>
-    <w:tbl>
-      <w:tblPr>
-        <w:tblW w:type="auto" w:w="0"/>
-        <w:tblLook w:firstColumn="1" w:firstRow="1" w:lastColumn="0" w:lastRow="0" w:noHBand="0" w:noVBand="1" w:val="04A0"/>
-      </w:tblPr>
-      <w:tblGrid>
-        <w:gridCol w:w="5103"/>
-        <w:gridCol w:w="5103"/>
-      </w:tblGrid>
-      <w:tr>
-        <w:tc>
-          <w:tcPr>
-            <w:tcW w:type="dxa" w:w="5103"/>
-          </w:tcPr>
-          <w:p>
-            <w:pPr>
-              <w:pStyle w:val="SectionH"/>
-            </w:pPr>
-            <w:r>
-              <w:rPr>
-                <w:b/>
-              </w:rPr>
-              <w:t>Soft Skills</w:t>
-            </w:r>
-          </w:p>
-        </w:tc>
-        <w:tc>
-          <w:tcPr>
-            <w:tcW w:type="dxa" w:w="5103"/>
-          </w:tcPr>
-          <w:p>
-            <w:pPr>
-              <w:pStyle w:val="SectionH"/>
-            </w:pPr>
-            <w:r>
-              <w:rPr>
-                <w:b/>
-              </w:rPr>
-              <w:t>Technical Skills</w:t>
-            </w:r>
-          </w:p>
-        </w:tc>
-      </w:tr>
-      <w:tr>
-        <w:tc>
-          <w:tcPr>
-            <w:tcW w:type="dxa" w:w="5103"/>
-          </w:tcPr>
-          <w:p>
-            <w:pPr>
-              <w:pStyle w:val="Body"/>
-            </w:pPr>
-            <w:r>
-              <w:t>Stakeholder Management, Team Supervision, Delivery Planning, Prioritization, Requirements Analysis, Task Management, Time Management, Problem Solving</w:t>
-            </w:r>
-          </w:p>
-        </w:tc>
-        <w:tc>
-          <w:tcPr>
-            <w:tcW w:type="dxa" w:w="5103"/>
-          </w:tcPr>
-          <w:p>
-            <w:pPr>
-              <w:pStyle w:val="Body"/>
-            </w:pPr>
-            <w:r>
-              <w:t>Programming Languages: C#, JavaScript, TypeScript, SQL. Backend: .NET Core and .NET, REST APIs, gRPC, GraphQL, SignalR, WebSocket, Apache Kafka. Frontend: Vue 3 with Nuxt, React, Svelte and SvelteKit. Data: SQL Server, PostgreSQL, SQLite, Redis, Git. DevOps: Docker, CI/CD pipelines, Linux and IIS hosting, Firebase. Architecture: system and database design, microservices and modular monoliths, SAP integration, offline first POS. Practices: JWT authentication, TDD, deployment and release pipelines (CI/CD)</w:t>
-            </w:r>
-          </w:p>
-        </w:tc>
-      </w:tr>
-    </w:tbl>
     <w:p>
       <w:pPr>
         <w:pStyle w:val="SectionH"/>
@@ -519,7 +443,7 @@
     </w:p>
     <w:sectPr>
       <w:pgSz w:w="11906" w:h="16838"/>
-      <w:pgMar w:top="680" w:right="850" w:bottom="680" w:left="850" w:header="720" w:footer="720" w:gutter="0"/>
+      <w:pgMar w:top="454" w:right="794" w:bottom="454" w:left="794" w:header="720" w:footer="720" w:gutter="0"/>
       <w:cols w:space="720"/>
       <w:docGrid w:linePitch="360"/>
     </w:sectPr>
@@ -735,15 +659,15 @@
   <w:docDefaults>
     <w:rPrDefault>
       <w:rPr>
-        <w:rFonts w:asciiTheme="minorHAnsi" w:eastAsiaTheme="minorEastAsia" w:hAnsiTheme="minorHAnsi" w:cstheme="minorBidi"/>
-        <w:sz w:val="22"/>
+        <w:rFonts w:asciiTheme="minorHAnsi" w:eastAsiaTheme="minorEastAsia" w:hAnsiTheme="minorHAnsi" w:cstheme="minorBidi" w:ascii="Arial" w:hAnsi="Arial" w:cs="Arial" w:eastAsia="Arial"/>
+        <w:sz w:val="20"/>
         <w:szCs w:val="22"/>
         <w:lang w:val="en-US" w:eastAsia="en-US" w:bidi="ar-SA"/>
       </w:rPr>
     </w:rPrDefault>
     <w:pPrDefault>
       <w:pPr>
-        <w:spacing w:after="200" w:line="276" w:lineRule="auto"/>
+        <w:spacing w:after="0" w:line="408" w:lineRule="auto" w:before="0"/>
       </w:pPr>
     </w:pPrDefault>
   </w:docDefaults>

</xml_diff>

<commit_message>
Publish the trimmed CV: no per-role tech lines, no Earlier line, rebuilt band and education
The published PDF and DOCX now carry the current build: the per-role Tech lines are
gone with their tokens folded into the capabilities band, the Earlier line is removed,
the education block names the Professional Certificate with its courses as a nested
sub bullet, and the Word version's band and section rules now match the PDF.
</commit_message>
<xml_diff>
--- a/static/cv/Rithea-Sreng-CV.docx
+++ b/static/cv/Rithea-Sreng-CV.docx
@@ -58,6 +58,9 @@
     <w:p>
       <w:pPr>
         <w:pStyle w:val="SectionH"/>
+        <w:pBdr>
+          <w:bottom w:val="single" w:sz="6" w:space="1" w:color="D9CFE4"/>
+        </w:pBdr>
       </w:pPr>
       <w:r>
         <w:t>PROFESSIONAL SUMMARY</w:t>
@@ -68,12 +71,15 @@
         <w:pStyle w:val="Body"/>
       </w:pPr>
       <w:r>
-        <w:t>Software development supervisor with more than seven years building systems for retail, ERP, logistics and ecommerce in Cambodia. Leads web development for the POS platform of a supermarket chain of 20+ stores: owns the delivery roadmap with business stakeholders, supervises the developers through code review and mentoring, sets the quality standards, and answers for a platform that runs 24 hours a day in every store. The direction I am working towards is owning that delivery as a manager. Technical depth from legacy .NET Framework to Vue 3 and .NET Core.</w:t>
+        <w:t>Software development supervisor with more than seven years on retail, ERP, logistics and ecommerce systems in Cambodia. Runs the POS platform of a 20+ store supermarket chain that trades 24 hours a day: owns the delivery roadmap, supervises the developers, and sets the quality standards, working towards owning that delivery as a manager.</w:t>
       </w:r>
     </w:p>
     <w:p>
       <w:pPr>
         <w:pStyle w:val="SectionH"/>
+        <w:pBdr>
+          <w:bottom w:val="single" w:sz="6" w:space="1" w:color="D9CFE4"/>
+        </w:pBdr>
       </w:pPr>
       <w:r>
         <w:t>CORE CAPABILITIES</w:t>
@@ -82,11 +88,12 @@
     <w:tbl>
       <w:tblPr>
         <w:tblW w:type="auto" w:w="0"/>
+        <w:tblLayout w:type="fixed"/>
         <w:tblLook w:firstColumn="1" w:firstRow="1" w:lastColumn="0" w:lastRow="0" w:noHBand="0" w:noVBand="1" w:val="04A0"/>
       </w:tblPr>
       <w:tblGrid>
-        <w:gridCol w:w="5159"/>
-        <w:gridCol w:w="5159"/>
+        <w:gridCol w:w="3095"/>
+        <w:gridCol w:w="7223"/>
       </w:tblGrid>
       <w:tr>
         <w:tc>
@@ -96,12 +103,15 @@
           <w:p>
             <w:pPr>
               <w:pStyle w:val="SectionH"/>
+              <w:pBdr>
+                <w:bottom w:val="single" w:sz="6" w:space="1" w:color="D9CFE4"/>
+              </w:pBdr>
             </w:pPr>
             <w:r>
               <w:rPr>
                 <w:b/>
               </w:rPr>
-              <w:t>Soft Skills</w:t>
+              <w:t>SOFT SKILLS</w:t>
             </w:r>
           </w:p>
         </w:tc>
@@ -112,12 +122,15 @@
           <w:p>
             <w:pPr>
               <w:pStyle w:val="SectionH"/>
+              <w:pBdr>
+                <w:bottom w:val="single" w:sz="6" w:space="1" w:color="D9CFE4"/>
+              </w:pBdr>
             </w:pPr>
             <w:r>
               <w:rPr>
                 <w:b/>
               </w:rPr>
-              <w:t>Technical Skills</w:t>
+              <w:t>TECHNICAL SKILLS</w:t>
             </w:r>
           </w:p>
         </w:tc>
@@ -125,27 +138,225 @@
       <w:tr>
         <w:tc>
           <w:tcPr>
-            <w:tcW w:type="dxa" w:w="5159"/>
+            <w:tcW w:type="dxa" w:w="3095"/>
           </w:tcPr>
           <w:p>
             <w:pPr>
-              <w:pStyle w:val="Body"/>
+              <w:pStyle w:val="ListBullet"/>
             </w:pPr>
             <w:r>
-              <w:t>Stakeholder Management, Team Supervision, Delivery Planning, Prioritization, Requirements Analysis, Task Management, Time Management, Problem Solving</w:t>
+              <w:rPr>
+                <w:sz w:val="19"/>
+              </w:rPr>
+              <w:t>Stakeholder Management</w:t>
+            </w:r>
+          </w:p>
+          <w:p>
+            <w:pPr>
+              <w:pStyle w:val="ListBullet"/>
+            </w:pPr>
+            <w:r>
+              <w:rPr>
+                <w:sz w:val="19"/>
+              </w:rPr>
+              <w:t>Team Supervision</w:t>
+            </w:r>
+          </w:p>
+          <w:p>
+            <w:pPr>
+              <w:pStyle w:val="ListBullet"/>
+            </w:pPr>
+            <w:r>
+              <w:rPr>
+                <w:sz w:val="19"/>
+              </w:rPr>
+              <w:t>Delivery Planning</w:t>
+            </w:r>
+          </w:p>
+          <w:p>
+            <w:pPr>
+              <w:pStyle w:val="ListBullet"/>
+            </w:pPr>
+            <w:r>
+              <w:rPr>
+                <w:sz w:val="19"/>
+              </w:rPr>
+              <w:t>Prioritization</w:t>
+            </w:r>
+          </w:p>
+          <w:p>
+            <w:pPr>
+              <w:pStyle w:val="ListBullet"/>
+            </w:pPr>
+            <w:r>
+              <w:rPr>
+                <w:sz w:val="19"/>
+              </w:rPr>
+              <w:t>Requirements Analysis</w:t>
+            </w:r>
+          </w:p>
+          <w:p>
+            <w:pPr>
+              <w:pStyle w:val="ListBullet"/>
+            </w:pPr>
+            <w:r>
+              <w:rPr>
+                <w:sz w:val="19"/>
+              </w:rPr>
+              <w:t>Task Management</w:t>
+            </w:r>
+          </w:p>
+          <w:p>
+            <w:pPr>
+              <w:pStyle w:val="ListBullet"/>
+            </w:pPr>
+            <w:r>
+              <w:rPr>
+                <w:sz w:val="19"/>
+              </w:rPr>
+              <w:t>Time Management</w:t>
+            </w:r>
+          </w:p>
+          <w:p>
+            <w:pPr>
+              <w:pStyle w:val="ListBullet"/>
+            </w:pPr>
+            <w:r>
+              <w:rPr>
+                <w:sz w:val="19"/>
+              </w:rPr>
+              <w:t>Problem Solving</w:t>
             </w:r>
           </w:p>
         </w:tc>
         <w:tc>
           <w:tcPr>
-            <w:tcW w:type="dxa" w:w="5159"/>
+            <w:tcW w:type="dxa" w:w="7223"/>
           </w:tcPr>
           <w:p>
             <w:pPr>
-              <w:pStyle w:val="Body"/>
+              <w:pStyle w:val="ListBullet"/>
             </w:pPr>
             <w:r>
-              <w:t>Programming Languages: C#, JavaScript, TypeScript, SQL. Backend: .NET Core and .NET, REST APIs, gRPC, GraphQL, SignalR, WebSocket, Apache Kafka. Frontend: Vue 3 with Nuxt, React, Svelte and SvelteKit. Data: SQL Server, PostgreSQL, SQLite, Redis, Git. DevOps: Docker, CI/CD pipelines, Linux and IIS hosting, Firebase. Architecture: system and database design, microservices and modular monoliths, SAP integration, offline first POS. Practices: JWT authentication, TDD, deployment and release pipelines (CI/CD)</w:t>
+              <w:rPr>
+                <w:b/>
+                <w:sz w:val="19"/>
+              </w:rPr>
+              <w:t xml:space="preserve">Programming Languages: </w:t>
+            </w:r>
+            <w:r>
+              <w:rPr>
+                <w:sz w:val="19"/>
+              </w:rPr>
+              <w:t>C#, JavaScript, TypeScript, SQL</w:t>
+            </w:r>
+          </w:p>
+          <w:p>
+            <w:pPr>
+              <w:pStyle w:val="ListBullet"/>
+            </w:pPr>
+            <w:r>
+              <w:rPr>
+                <w:b/>
+                <w:sz w:val="19"/>
+              </w:rPr>
+              <w:t xml:space="preserve">Backend: </w:t>
+            </w:r>
+            <w:r>
+              <w:rPr>
+                <w:sz w:val="19"/>
+              </w:rPr>
+              <w:t>.NET Framework 4.x, .NET Core and .NET, REST APIs, gRPC, GraphQL, SignalR, WebSocket, Apache Kafka</w:t>
+            </w:r>
+          </w:p>
+          <w:p>
+            <w:pPr>
+              <w:pStyle w:val="ListBullet"/>
+            </w:pPr>
+            <w:r>
+              <w:rPr>
+                <w:b/>
+                <w:sz w:val="19"/>
+              </w:rPr>
+              <w:t xml:space="preserve">Frontend: </w:t>
+            </w:r>
+            <w:r>
+              <w:rPr>
+                <w:sz w:val="19"/>
+              </w:rPr>
+              <w:t>Vue 3 with Nuxt, React, Next.js, Svelte, SvelteKit, Flutter and native Android</w:t>
+            </w:r>
+          </w:p>
+          <w:p>
+            <w:pPr>
+              <w:pStyle w:val="ListBullet"/>
+            </w:pPr>
+            <w:r>
+              <w:rPr>
+                <w:b/>
+                <w:sz w:val="19"/>
+              </w:rPr>
+              <w:t xml:space="preserve">Data: </w:t>
+            </w:r>
+            <w:r>
+              <w:rPr>
+                <w:sz w:val="19"/>
+              </w:rPr>
+              <w:t>SQL Server, PostgreSQL, SQLite, Redis, encrypted data storage, Git</w:t>
+            </w:r>
+          </w:p>
+          <w:p>
+            <w:pPr>
+              <w:pStyle w:val="ListBullet"/>
+            </w:pPr>
+            <w:r>
+              <w:rPr>
+                <w:b/>
+                <w:sz w:val="19"/>
+              </w:rPr>
+              <w:t xml:space="preserve">DevOps: </w:t>
+            </w:r>
+            <w:r>
+              <w:rPr>
+                <w:sz w:val="19"/>
+              </w:rPr>
+              <w:t>Docker, CI/CD pipelines, Linux, nginx and IIS hosting, Firebase</w:t>
+            </w:r>
+          </w:p>
+          <w:p>
+            <w:pPr>
+              <w:pStyle w:val="ListBullet"/>
+            </w:pPr>
+            <w:r>
+              <w:rPr>
+                <w:b/>
+                <w:sz w:val="19"/>
+              </w:rPr>
+              <w:t xml:space="preserve">Architecture: </w:t>
+            </w:r>
+            <w:r>
+              <w:rPr>
+                <w:sz w:val="19"/>
+              </w:rPr>
+              <w:t>system and database design, microservices and modular monoliths, SAP integration, offline first POS</w:t>
+            </w:r>
+          </w:p>
+          <w:p>
+            <w:pPr>
+              <w:pStyle w:val="ListBullet"/>
+            </w:pPr>
+            <w:r>
+              <w:rPr>
+                <w:b/>
+                <w:sz w:val="19"/>
+              </w:rPr>
+              <w:t xml:space="preserve">Practices: </w:t>
+            </w:r>
+            <w:r>
+              <w:rPr>
+                <w:sz w:val="19"/>
+              </w:rPr>
+              <w:t>JWT authentication, TDD, deployment and release pipelines (CI/CD)</w:t>
             </w:r>
           </w:p>
         </w:tc>
@@ -154,6 +365,9 @@
     <w:p>
       <w:pPr>
         <w:pStyle w:val="SectionH"/>
+        <w:pBdr>
+          <w:bottom w:val="single" w:sz="6" w:space="1" w:color="D9CFE4"/>
+        </w:pBdr>
       </w:pPr>
       <w:r>
         <w:t>PROFESSIONAL EXPERIENCE</w:t>
@@ -233,14 +447,6 @@
     </w:p>
     <w:p>
       <w:pPr>
-        <w:pStyle w:val="TechLine"/>
-      </w:pPr>
-      <w:r>
-        <w:t>Tech: C# (.NET Core), TypeScript and JavaScript, Vue 3 with Nuxt, SQL Server, PostgreSQL, SQLite, Redis; Linux (nginx) and Windows (IIS) hosting; SAP and other ERP integration.</w:t>
-      </w:r>
-    </w:p>
-    <w:p>
-      <w:pPr>
         <w:pStyle w:val="RoleLine"/>
       </w:pPr>
       <w:r>
@@ -269,14 +475,6 @@
       </w:pPr>
       <w:r>
         <w:t>Shipped every layer of the stack from database to interface across two generations, in .NET Framework and .NET Core with React, Svelte or Next.js.</w:t>
-      </w:r>
-    </w:p>
-    <w:p>
-      <w:pPr>
-        <w:pStyle w:val="TechLine"/>
-      </w:pPr>
-      <w:r>
-        <w:t>Tech: C# (.NET Framework 4.x, .NET Core), JavaScript, TypeScript, React, Svelte, Next.js, Flutter, native Android; SQL Server; encrypted file storage.</w:t>
       </w:r>
     </w:p>
     <w:p>
@@ -313,23 +511,10 @@
     </w:p>
     <w:p>
       <w:pPr>
-        <w:pStyle w:val="TechLine"/>
-      </w:pPr>
-      <w:r>
-        <w:t>Tech: C# (.NET Framework 4.x), JavaScript, SQL Server, SignalR.</w:t>
-      </w:r>
-    </w:p>
-    <w:p>
-      <w:pPr>
-        <w:pStyle w:val="Body"/>
-      </w:pPr>
-      <w:r>
-        <w:t>Earlier: 2019 – 2020, built a logistics system and an ecommerce platform from zero, before the One Click Solution engagement.</w:t>
-      </w:r>
-    </w:p>
-    <w:p>
-      <w:pPr>
         <w:pStyle w:val="SectionH"/>
+        <w:pBdr>
+          <w:bottom w:val="single" w:sz="6" w:space="1" w:color="D9CFE4"/>
+        </w:pBdr>
       </w:pPr>
       <w:r>
         <w:t>KEY STRENGTHS</w:t>
@@ -370,6 +555,9 @@
     <w:p>
       <w:pPr>
         <w:pStyle w:val="SectionH"/>
+        <w:pBdr>
+          <w:bottom w:val="single" w:sz="6" w:space="1" w:color="D9CFE4"/>
+        </w:pBdr>
       </w:pPr>
       <w:r>
         <w:t>EDUCATION &amp; CERTIFICATIONS</w:t>
@@ -380,7 +568,7 @@
         <w:pStyle w:val="ListBullet"/>
       </w:pPr>
       <w:r>
-        <w:t xml:space="preserve">Google Project Management Certificate, Coursera, 2026, </w:t>
+        <w:t xml:space="preserve">Google Project Management Professional Certificate, Coursera, credential </w:t>
       </w:r>
       <w:hyperlink r:id="rId11">
         <w:r>
@@ -388,11 +576,19 @@
             <w:color w:val="52306F"/>
             <w:u w:val="single"/>
           </w:rPr>
-          <w:t>ID 8SM29XFB8QF8</w:t>
+          <w:t>8SM29XFB8QF8</w:t>
         </w:r>
       </w:hyperlink>
       <w:r>
-        <w:t>: Foundations of Project Management, Project Initiation, Project Planning, Project Execution, Agile Project Management, Capstone</w:t>
+        <w:t>, 2026</w:t>
+      </w:r>
+    </w:p>
+    <w:p>
+      <w:pPr>
+        <w:pStyle w:val="ListBullet2"/>
+      </w:pPr>
+      <w:r>
+        <w:t>Courses: Foundations of Project Management, Project Initiation, Project Planning, Project Execution, Agile Project Management, Capstone</w:t>
       </w:r>
     </w:p>
     <w:p>
@@ -400,12 +596,15 @@
         <w:pStyle w:val="ListBullet"/>
       </w:pPr>
       <w:r>
-        <w:t>Bachelor of Computer Science, National Polytechnic Institute of Cambodia (2019 – 2022)</w:t>
+        <w:t>Bachelor of Computer Science, National Polytechnic Institute of Cambodia, 2019 – 2022</w:t>
       </w:r>
     </w:p>
     <w:p>
       <w:pPr>
         <w:pStyle w:val="SectionH"/>
+        <w:pBdr>
+          <w:bottom w:val="single" w:sz="6" w:space="1" w:color="D9CFE4"/>
+        </w:pBdr>
       </w:pPr>
       <w:r>
         <w:t>LANGUAGES</w:t>
@@ -422,6 +621,9 @@
     <w:p>
       <w:pPr>
         <w:pStyle w:val="SectionH"/>
+        <w:pBdr>
+          <w:bottom w:val="single" w:sz="6" w:space="1" w:color="D9CFE4"/>
+        </w:pBdr>
       </w:pPr>
       <w:r>
         <w:t>REFERENCES</w:t>
@@ -12510,6 +12712,10 @@
   <w:style w:type="paragraph" w:customStyle="1" w:styleId="RoleLine">
     <w:name w:val="RoleLine"/>
     <w:basedOn w:val="Normal"/>
+    <w:pPr>
+      <w:keepNext/>
+      <w:spacing w:before="200" w:after="20"/>
+    </w:pPr>
     <w:rPr>
       <w:rFonts w:ascii="Arial" w:hAnsi="Arial"/>
       <w:b/>
@@ -12538,6 +12744,10 @@
   <w:style w:type="paragraph" w:customStyle="1" w:styleId="SectionH">
     <w:name w:val="SectionH"/>
     <w:basedOn w:val="Normal"/>
+    <w:pPr>
+      <w:keepNext/>
+      <w:spacing w:before="240" w:after="60"/>
+    </w:pPr>
     <w:rPr>
       <w:rFonts w:ascii="Arial" w:hAnsi="Arial"/>
       <w:b/>
@@ -12557,6 +12767,10 @@
   <w:style w:type="paragraph" w:customStyle="1" w:styleId="Meta">
     <w:name w:val="Meta"/>
     <w:basedOn w:val="Normal"/>
+    <w:pPr>
+      <w:keepNext/>
+      <w:spacing w:after="40"/>
+    </w:pPr>
     <w:rPr>
       <w:rFonts w:ascii="Arial" w:hAnsi="Arial"/>
       <w:color w:val="4B3A5E"/>

</xml_diff>

<commit_message>
Publish the corrected CV: measured sales figure, and fix the clipped skills column
</commit_message>
<xml_diff>
--- a/static/cv/Rithea-Sreng-CV.docx
+++ b/static/cv/Rithea-Sreng-CV.docx
@@ -87,7 +87,7 @@
     </w:p>
     <w:tbl>
       <w:tblPr>
-        <w:tblW w:type="auto" w:w="0"/>
+        <w:tblW w:type="dxa" w:w="10318"/>
         <w:tblLayout w:type="fixed"/>
         <w:tblLook w:firstColumn="1" w:firstRow="1" w:lastColumn="0" w:lastRow="0" w:noHBand="0" w:noVBand="1" w:val="04A0"/>
       </w:tblPr>
@@ -98,7 +98,7 @@
       <w:tr>
         <w:tc>
           <w:tcPr>
-            <w:tcW w:type="dxa" w:w="5159"/>
+            <w:tcW w:type="dxa" w:w="3095"/>
           </w:tcPr>
           <w:p>
             <w:pPr>
@@ -117,7 +117,7 @@
         </w:tc>
         <w:tc>
           <w:tcPr>
-            <w:tcW w:type="dxa" w:w="5159"/>
+            <w:tcW w:type="dxa" w:w="7223"/>
           </w:tcPr>
           <w:p>
             <w:pPr>
@@ -394,7 +394,7 @@
         <w:pStyle w:val="ListBullet"/>
       </w:pPr>
       <w:r>
-        <w:t>Own the group's POS platform across 20+ stores, the chain's best sales year while I have led it at about US$5M in sales, by prioritizing the delivery roadmap with stakeholders, managing the developers through code review and mentoring, and coordinating with store operations daily.</w:t>
+        <w:t>Own the group's POS platform across 20+ stores, the chain's best sales year while I have led it at more than US$20M in annual sales, by prioritizing the delivery roadmap with stakeholders, managing the developers through code review and mentoring, and coordinating with store operations daily.</w:t>
       </w:r>
     </w:p>
     <w:p>

</xml_diff>

<commit_message>
Set the document properties on the published CV
The DOCX carried python-docx's own template values, including the string
'python-docx generated by python-docx' and a 2013 creation stamp, which say a script produced
the file. Author, Title and creation date are now set, the generator and version strings are
gone from app.xml, and the PDF carries the same Author and Title with the generator name
blanked. The published pair is now the weasyprint build plus its Word counterpart, both
clean, and the parity guard is green again.
</commit_message>
<xml_diff>
--- a/static/cv/Rithea-Sreng-CV.docx
+++ b/static/cv/Rithea-Sreng-CV.docx
@@ -87,7 +87,7 @@
     </w:p>
     <w:tbl>
       <w:tblPr>
-        <w:tblW w:type="dxa" w:w="10318"/>
+        <w:tblW w:type="auto" w:w="0"/>
         <w:tblLayout w:type="fixed"/>
         <w:tblLook w:firstColumn="1" w:firstRow="1" w:lastColumn="0" w:lastRow="0" w:noHBand="0" w:noVBand="1" w:val="04A0"/>
       </w:tblPr>
@@ -98,7 +98,7 @@
       <w:tr>
         <w:tc>
           <w:tcPr>
-            <w:tcW w:type="dxa" w:w="3095"/>
+            <w:tcW w:type="dxa" w:w="5159"/>
           </w:tcPr>
           <w:p>
             <w:pPr>
@@ -117,7 +117,7 @@
         </w:tc>
         <w:tc>
           <w:tcPr>
-            <w:tcW w:type="dxa" w:w="7223"/>
+            <w:tcW w:type="dxa" w:w="5159"/>
           </w:tcPr>
           <w:p>
             <w:pPr>
@@ -394,7 +394,7 @@
         <w:pStyle w:val="ListBullet"/>
       </w:pPr>
       <w:r>
-        <w:t>Own the group's POS platform across 20+ stores, the chain's best sales year while I have led it at more than US$20M in annual sales, by prioritizing the delivery roadmap with stakeholders, managing the developers through code review and mentoring, and coordinating with store operations daily.</w:t>
+        <w:t>Own the group's POS platform across 20+ stores, the chain's best sales year while I have led it at more than US$20M in annual sales, by prioritizing the delivery roadmap with stakeholders, managing the developers through code review and mentoring, and coordinating with store operations.</w:t>
       </w:r>
     </w:p>
     <w:p>
@@ -482,7 +482,7 @@
         <w:pStyle w:val="RoleLine"/>
       </w:pPr>
       <w:r>
-        <w:t>Full Stack Developer and Project leader | One Click Solution | Part time</w:t>
+        <w:t>Full Stack Developer and Project leader | One Click Solution</w:t>
       </w:r>
     </w:p>
     <w:p>
@@ -490,7 +490,7 @@
         <w:pStyle w:val="Meta"/>
       </w:pPr>
       <w:r>
-        <w:t>Nov 2020 – Feb 2023  |  Part time  |  Phnom Penh, Cambodia</w:t>
+        <w:t>Nov 2020 – Feb 2023  |  Phnom Penh, Cambodia</w:t>
       </w:r>
     </w:p>
     <w:p>

</xml_diff>